<commit_message>
Use B Nazanin font for algorithm numbers; final step has no algorithm label
Co-authored-by: sazmanfava854-sudo <sazmanfava854-sudo@users.noreply.github.com>
</commit_message>
<xml_diff>
--- a/docs/system_flow_diagram.docx
+++ b/docs/system_flow_diagram.docx
@@ -22,7 +22,7 @@
       <w:r>
         <w:drawing>
           <wp:inline xmlns:a="http://schemas.openxmlformats.org/drawingml/2006/main" xmlns:pic="http://schemas.openxmlformats.org/drawingml/2006/picture">
-            <wp:extent cx="5303520" cy="10546909"/>
+            <wp:extent cx="5303520" cy="463289"/>
             <wp:docPr id="1" name="Picture 1"/>
             <wp:cNvGraphicFramePr>
               <a:graphicFrameLocks noChangeAspect="1"/>
@@ -43,7 +43,7 @@
                   <pic:spPr>
                     <a:xfrm>
                       <a:off x="0" y="0"/>
-                      <a:ext cx="5303520" cy="10546909"/>
+                      <a:ext cx="5303520" cy="463289"/>
                     </a:xfrm>
                     <a:prstGeom prst="rect"/>
                   </pic:spPr>

</xml_diff>

<commit_message>
Fix broken PNG (was 40k px wide); rewrite diagram with PIL at 1800x3700
Co-authored-by: sazmanfava854-sudo <sazmanfava854-sudo@users.noreply.github.com>
</commit_message>
<xml_diff>
--- a/docs/system_flow_diagram.docx
+++ b/docs/system_flow_diagram.docx
@@ -22,7 +22,7 @@
       <w:r>
         <w:drawing>
           <wp:inline xmlns:a="http://schemas.openxmlformats.org/drawingml/2006/main" xmlns:pic="http://schemas.openxmlformats.org/drawingml/2006/picture">
-            <wp:extent cx="5303520" cy="463289"/>
+            <wp:extent cx="5029200" cy="10337800"/>
             <wp:docPr id="1" name="Picture 1"/>
             <wp:cNvGraphicFramePr>
               <a:graphicFrameLocks noChangeAspect="1"/>
@@ -43,7 +43,7 @@
                   <pic:spPr>
                     <a:xfrm>
                       <a:off x="0" y="0"/>
-                      <a:ext cx="5303520" cy="463289"/>
+                      <a:ext cx="5029200" cy="10337800"/>
                     </a:xfrm>
                     <a:prstGeom prst="rect"/>
                   </pic:spPr>

</xml_diff>